<commit_message>
escopo do projeto v0.1 OP#166
</commit_message>
<xml_diff>
--- a/docs/ESCOPO-0102-grupo05.docx
+++ b/docs/ESCOPO-0102-grupo05.docx
@@ -167,25 +167,291 @@
     </w:p>
     <w:p>
       <w:pPr>
-        <w:spacing w:after="240" w:line="276" w:lineRule="auto"/>
-        <w:rPr>
-          <w:i w:val="0"/>
-          <w:iCs w:val="0"/>
-        </w:rPr>
+        <w:pStyle w:val="Normal"/>
+        <w:suppressLineNumbers w:val="0"/>
+        <w:bidi w:val="0"/>
+        <w:spacing w:before="0" w:beforeAutospacing="off" w:after="240" w:afterAutospacing="off" w:line="276" w:lineRule="auto"/>
+        <w:ind w:left="0" w:right="0"/>
+        <w:jc w:val="left"/>
       </w:pPr>
       <w:r>
         <w:rPr>
           <w:i w:val="0"/>
           <w:iCs w:val="0"/>
         </w:rPr>
-        <w:t xml:space="preserve">(Que dor existe hoje, antes de vocês construírem qualquer </w:t>
+        <w:t xml:space="preserve">Hoje </w:t>
       </w:r>
       <w:r>
         <w:rPr>
           <w:i w:val="0"/>
           <w:iCs w:val="0"/>
         </w:rPr>
-        <w:t>coisa)</w:t>
+        <w:t xml:space="preserve">uma instrutora autônoma formalizada como MEI, que oferece cursos de Excel e </w:t>
+      </w:r>
+      <w:r>
+        <w:rPr>
+          <w:i w:val="0"/>
+          <w:iCs w:val="0"/>
+        </w:rPr>
+        <w:t>rotinas administrativas para turmas pequenas,</w:t>
+      </w:r>
+      <w:r>
+        <w:rPr>
+          <w:i w:val="0"/>
+          <w:iCs w:val="0"/>
+        </w:rPr>
+        <w:t xml:space="preserve"> precisa</w:t>
+      </w:r>
+      <w:r>
+        <w:rPr>
+          <w:i w:val="0"/>
+          <w:iCs w:val="0"/>
+        </w:rPr>
+        <w:t xml:space="preserve"> </w:t>
+      </w:r>
+      <w:r>
+        <w:rPr>
+          <w:i w:val="0"/>
+          <w:iCs w:val="0"/>
+        </w:rPr>
+        <w:t>criar</w:t>
+      </w:r>
+      <w:r>
+        <w:rPr>
+          <w:i w:val="0"/>
+          <w:iCs w:val="0"/>
+        </w:rPr>
+        <w:t xml:space="preserve"> seus</w:t>
+      </w:r>
+      <w:r>
+        <w:rPr>
+          <w:i w:val="0"/>
+          <w:iCs w:val="0"/>
+        </w:rPr>
+        <w:t xml:space="preserve"> certificados</w:t>
+      </w:r>
+      <w:r>
+        <w:rPr>
+          <w:i w:val="0"/>
+          <w:iCs w:val="0"/>
+        </w:rPr>
+        <w:t xml:space="preserve"> de conclusão</w:t>
+      </w:r>
+      <w:r>
+        <w:rPr>
+          <w:i w:val="0"/>
+          <w:iCs w:val="0"/>
+        </w:rPr>
+        <w:t xml:space="preserve">, mas </w:t>
+      </w:r>
+      <w:r>
+        <w:rPr>
+          <w:i w:val="0"/>
+          <w:iCs w:val="0"/>
+        </w:rPr>
+        <w:t>a falta de autenticidade desses documentos leva contratantes</w:t>
+      </w:r>
+      <w:r>
+        <w:rPr>
+          <w:i w:val="0"/>
+          <w:iCs w:val="0"/>
+        </w:rPr>
+        <w:t xml:space="preserve"> a</w:t>
+      </w:r>
+      <w:r>
+        <w:rPr>
+          <w:i w:val="0"/>
+          <w:iCs w:val="0"/>
+        </w:rPr>
+        <w:t xml:space="preserve"> validarem diretamente com a escola</w:t>
+      </w:r>
+      <w:r>
+        <w:rPr>
+          <w:i w:val="0"/>
+          <w:iCs w:val="0"/>
+        </w:rPr>
+        <w:t xml:space="preserve">, o que causa </w:t>
+      </w:r>
+      <w:r>
+        <w:rPr>
+          <w:i w:val="0"/>
+          <w:iCs w:val="0"/>
+        </w:rPr>
+        <w:t>atraso e/ou falta de credibilidade em seus cursos</w:t>
+      </w:r>
+      <w:r>
+        <w:rPr>
+          <w:i w:val="0"/>
+          <w:iCs w:val="0"/>
+        </w:rPr>
+        <w:t>.</w:t>
+      </w:r>
+    </w:p>
+    <w:p>
+      <w:pPr>
+        <w:pStyle w:val="Normal"/>
+        <w:suppressLineNumbers w:val="0"/>
+        <w:bidi w:val="0"/>
+        <w:spacing w:before="0" w:beforeAutospacing="off" w:after="240" w:afterAutospacing="off" w:line="276" w:lineRule="auto"/>
+        <w:ind w:left="0" w:right="0"/>
+        <w:jc w:val="left"/>
+        <w:rPr>
+          <w:rFonts w:ascii="Calibri" w:hAnsi="Calibri" w:eastAsia="Calibri" w:cs="Calibri"/>
+          <w:noProof w:val="0"/>
+          <w:sz w:val="22"/>
+          <w:szCs w:val="22"/>
+          <w:lang w:val="pt-BR"/>
+        </w:rPr>
+      </w:pPr>
+      <w:r>
+        <w:rPr>
+          <w:b w:val="1"/>
+          <w:bCs w:val="1"/>
+          <w:i w:val="0"/>
+          <w:iCs w:val="0"/>
+        </w:rPr>
+        <w:t>Evidência</w:t>
+      </w:r>
+      <w:r>
+        <w:rPr>
+          <w:b w:val="1"/>
+          <w:bCs w:val="1"/>
+          <w:i w:val="0"/>
+          <w:iCs w:val="0"/>
+        </w:rPr>
+        <w:t>:</w:t>
+      </w:r>
+      <w:r>
+        <w:br/>
+      </w:r>
+      <w:r>
+        <w:drawing>
+          <wp:inline wp14:editId="3EBA8EB4" wp14:anchorId="7ADC41A1">
+            <wp:extent cx="2933700" cy="2026322"/>
+            <wp:effectExtent l="0" t="0" r="0" b="0"/>
+            <wp:docPr id="1607568709" name="drawing"/>
+            <wp:cNvGraphicFramePr>
+              <a:graphicFrameLocks noChangeAspect="1"/>
+            </wp:cNvGraphicFramePr>
+            <a:graphic>
+              <a:graphicData xmlns:a="http://schemas.openxmlformats.org/drawingml/2006/main" uri="http://schemas.openxmlformats.org/drawingml/2006/picture">
+                <pic:pic xmlns:pic="http://schemas.openxmlformats.org/drawingml/2006/picture">
+                  <pic:nvPicPr>
+                    <pic:cNvPr id="1607568709" name="Picture 1607568709"/>
+                    <pic:cNvPicPr/>
+                  </pic:nvPicPr>
+                  <pic:blipFill>
+                    <a:blip xmlns:r="http://schemas.openxmlformats.org/officeDocument/2006/relationships" r:embed="rId1504530709">
+                      <a:extLst>
+                        <a:ext uri="{28A0092B-C50C-407E-A947-70E740481C1C}">
+                          <a14:useLocalDpi xmlns:a14="http://schemas.microsoft.com/office/drawing/2010/main"/>
+                        </a:ext>
+                      </a:extLst>
+                    </a:blip>
+                    <a:stretch>
+                      <a:fillRect/>
+                    </a:stretch>
+                  </pic:blipFill>
+                  <pic:spPr>
+                    <a:xfrm rot="0">
+                      <a:off x="0" y="0"/>
+                      <a:ext cx="2933700" cy="2026322"/>
+                    </a:xfrm>
+                    <a:prstGeom prst="rect">
+                      <a:avLst/>
+                    </a:prstGeom>
+                  </pic:spPr>
+                </pic:pic>
+              </a:graphicData>
+            </a:graphic>
+          </wp:inline>
+        </w:drawing>
+      </w:r>
+      <w:r>
+        <w:drawing>
+          <wp:inline wp14:editId="4471A20F" wp14:anchorId="468A3ABF">
+            <wp:extent cx="2877243" cy="2028825"/>
+            <wp:effectExtent l="0" t="0" r="0" b="0"/>
+            <wp:docPr id="1207724159" name="drawing"/>
+            <wp:cNvGraphicFramePr>
+              <a:graphicFrameLocks noChangeAspect="1"/>
+            </wp:cNvGraphicFramePr>
+            <a:graphic>
+              <a:graphicData xmlns:a="http://schemas.openxmlformats.org/drawingml/2006/main" uri="http://schemas.openxmlformats.org/drawingml/2006/picture">
+                <pic:pic xmlns:pic="http://schemas.openxmlformats.org/drawingml/2006/picture">
+                  <pic:nvPicPr>
+                    <pic:cNvPr id="1207724159" name="Picture 1207724159"/>
+                    <pic:cNvPicPr/>
+                  </pic:nvPicPr>
+                  <pic:blipFill>
+                    <a:blip xmlns:r="http://schemas.openxmlformats.org/officeDocument/2006/relationships" r:embed="rId1278733148">
+                      <a:extLst>
+                        <a:ext uri="{28A0092B-C50C-407E-A947-70E740481C1C}">
+                          <a14:useLocalDpi xmlns:a14="http://schemas.microsoft.com/office/drawing/2010/main"/>
+                        </a:ext>
+                      </a:extLst>
+                    </a:blip>
+                    <a:stretch>
+                      <a:fillRect/>
+                    </a:stretch>
+                  </pic:blipFill>
+                  <pic:spPr>
+                    <a:xfrm rot="0">
+                      <a:off x="0" y="0"/>
+                      <a:ext cx="2877243" cy="2028825"/>
+                    </a:xfrm>
+                    <a:prstGeom prst="rect">
+                      <a:avLst/>
+                    </a:prstGeom>
+                  </pic:spPr>
+                </pic:pic>
+              </a:graphicData>
+            </a:graphic>
+          </wp:inline>
+        </w:drawing>
+      </w:r>
+      <w:r>
+        <w:br/>
+      </w:r>
+      <w:r>
+        <w:rPr>
+          <w:rFonts w:ascii="Calibri" w:hAnsi="Calibri" w:eastAsia="Calibri" w:cs="Calibri"/>
+          <w:b w:val="0"/>
+          <w:bCs w:val="0"/>
+          <w:i w:val="1"/>
+          <w:iCs w:val="1"/>
+          <w:caps w:val="0"/>
+          <w:smallCaps w:val="0"/>
+          <w:strike w:val="0"/>
+          <w:dstrike w:val="0"/>
+          <w:noProof w:val="0"/>
+          <w:color w:val="000000" w:themeColor="text1" w:themeTint="FF" w:themeShade="FF"/>
+          <w:sz w:val="19"/>
+          <w:szCs w:val="19"/>
+          <w:u w:val="none"/>
+          <w:lang w:val="pt-BR"/>
+        </w:rPr>
+        <w:t>Comentário: Cerificado real emitido, mas sem forma de verificar a autenticidade (sem código</w:t>
+      </w:r>
+      <w:r>
+        <w:rPr>
+          <w:rFonts w:ascii="Calibri" w:hAnsi="Calibri" w:eastAsia="Calibri" w:cs="Calibri"/>
+          <w:b w:val="0"/>
+          <w:bCs w:val="0"/>
+          <w:i w:val="1"/>
+          <w:iCs w:val="1"/>
+          <w:caps w:val="0"/>
+          <w:smallCaps w:val="0"/>
+          <w:strike w:val="0"/>
+          <w:dstrike w:val="0"/>
+          <w:noProof w:val="0"/>
+          <w:color w:val="000000" w:themeColor="text1" w:themeTint="FF" w:themeShade="FF"/>
+          <w:sz w:val="19"/>
+          <w:szCs w:val="19"/>
+          <w:u w:val="none"/>
+          <w:lang w:val="pt-BR"/>
+        </w:rPr>
+        <w:t>).</w:t>
       </w:r>
     </w:p>
     <w:p>

</xml_diff>